<commit_message>
Align reviewer cover allowance and final project documentation
</commit_message>
<xml_diff>
--- a/docs/submission/additional-features.docx
+++ b/docs/submission/additional-features.docx
@@ -125,15 +125,15 @@
         <w:jc w:val="both"/>
       </w:pPr>
       <w:r>
-        <w:t xml:space="preserve">Веб-кабинет дополнен обложкой, карточками путешествий и тематическими иллюстрациями </w:t>
+        <w:t xml:space="preserve">Веб-кабинет дополнен обложкой, карточками путешествий и тематическими иллюстрациями Yandex Cloud Images. ИИ-изображения помечены как иллюстрации, а не фотографии. Создание обложки работает отдельно от построения маршрута: ошибка изображения не удаляет поездку. Сохранённая обложка используется повторно без нового платного запроса; архитектурная точность изображения не гарантируется.</w:t>
       </w:r>
       <w:proofErr w:type="spellStart"/>
       <w:r>
-        <w:t>YandexART</w:t>
+        <w:t/>
       </w:r>
       <w:proofErr w:type="spellEnd"/>
       <w:r>
-        <w:t>. ИИ-изображения помечены как иллюстрации. Создание обложки работает отдельно от построения маршрута: ошибка изображения не удаляет поездку. Сохранённая обложка используется повторно без нового запроса на генерацию.</w:t>
+        <w:t/>
       </w:r>
     </w:p>
     <w:p>
@@ -161,6 +161,72 @@
     <w:p>
       <w:pPr>
         <w:keepNext/>
+        <w:spacing w:before="100" w:after="120"/>
+        <w:jc w:val="both"/>
+      </w:pPr>
+      <w:r>
+        <w:rPr>
+          <w:b/>
+        </w:rPr>
+        <w:t xml:space="preserve">Удаление ненужных поездок</w:t>
+      </w:r>
+    </w:p>
+    <w:p>
+      <w:pPr>
+        <w:spacing w:after="120"/>
+        <w:jc w:val="both"/>
+      </w:pPr>
+      <w:r>
+        <w:t xml:space="preserve">Пользователь может удалить поездку из кабинета, включая дубли, созданные при тестировании. Связанные файлы очищаются, а технический учёт использованных попыток сохраняется.</w:t>
+      </w:r>
+    </w:p>
+    <w:p>
+      <w:pPr>
+        <w:keepNext/>
+        <w:spacing w:before="100" w:after="120"/>
+        <w:jc w:val="both"/>
+      </w:pPr>
+      <w:r>
+        <w:rPr>
+          <w:b/>
+        </w:rPr>
+        <w:t xml:space="preserve">Перестановка дней городского маршрута</w:t>
+      </w:r>
+    </w:p>
+    <w:p>
+      <w:pPr>
+        <w:spacing w:after="120"/>
+        <w:jc w:val="both"/>
+      </w:pPr>
+      <w:r>
+        <w:t xml:space="preserve">Два дня можно поменять местами без нового запроса к ИИ, если сохранены необходимые данные для повторной проверки. Посещения переносятся на новые даты; неподходящая перестановка не изменяет маршрут. Для региональных поездок с переездами эта операция пока недоступна.</w:t>
+      </w:r>
+    </w:p>
+    <w:p>
+      <w:pPr>
+        <w:keepNext/>
+        <w:spacing w:before="100" w:after="120"/>
+        <w:jc w:val="both"/>
+      </w:pPr>
+      <w:r>
+        <w:rPr>
+          <w:b/>
+        </w:rPr>
+        <w:t xml:space="preserve">Уточнение направления и понятные названия</w:t>
+      </w:r>
+    </w:p>
+    <w:p>
+      <w:pPr>
+        <w:spacing w:after="120"/>
+        <w:jc w:val="both"/>
+      </w:pPr>
+      <w:r>
+        <w:t xml:space="preserve">В веб-анкете город или территория и страна задаются отдельно; неоднозначное место уточняется перед планированием. Для иностранных мест сохраняется исходное название и добавляется русское название либо пояснение типа объекта. Это облегчает чтение маршрута и сохраняет связь с картой.</w:t>
+      </w:r>
+    </w:p>
+    <w:p>
+      <w:pPr>
+        <w:keepNext/>
         <w:spacing w:after="200"/>
         <w:jc w:val="both"/>
       </w:pPr>
@@ -190,7 +256,7 @@
         <w:jc w:val="both"/>
       </w:pPr>
       <w:r>
-        <w:t>Владелец выдаёт проверяющему личную ссылку. По умолчанию приглашение рассчитано на одного человека, действует 7 дней с момента создания и даёт 5 попыток создания или ИИ-изменения поездки суммарно за срок доступа. Это общий лимит, а не пять попыток в сутки. Просмотр сохранённой поездки и скачивание PDF этот лимит не расходуют.</w:t>
+        <w:t xml:space="preserve">Владелец выдаёт проверяющему личную ссылку. Для сдачи подготовлено приглашение на 8 суток с момента создания, для одного человека: 5 попыток создания или ИИ-изменения поездки и отдельно 5 попыток обложек на весь срок. Лимиты не обновляются ежедневно. Просмотр сохранённой поездки, PDF и повторное открытие картинки попытки не расходуют. Первым активировавший ссылку Telegram-аккаунт занимает единственное место; доступ можно отозвать.</w:t>
       </w:r>
     </w:p>
     <w:p>
@@ -199,7 +265,7 @@
         <w:jc w:val="both"/>
       </w:pPr>
       <w:r>
-        <w:t>Попытка учитывается при запуске платной операции, в том числе если она завершилась ошибкой. Внутренние обращения к модели при исправлении ответа могут быть многочисленнее пользовательских попыток. Для ИИ-обложек предусмотрен отдельный лимит. При необходимости владелец выдаёт новое приглашение.</w:t>
+        <w:t xml:space="preserve">Попытка учитывается при запуске платной операции, в том числе если она завершилась ошибкой. Внутренних обращений к модели может быть больше, чем пользовательских попыток. ИИ-правка поездки расходует маршрутную попытку, но сама по себе не запускает новую картинку. При необходимости владелец может выдать новое личное приглашение.</w:t>
       </w:r>
     </w:p>
     <w:p>
@@ -221,11 +287,11 @@
         <w:jc w:val="both"/>
       </w:pPr>
       <w:r>
-        <w:t xml:space="preserve">Вход выполняется по одноразовой ссылке из Telegram. После входа кабинет проверяет владельца поездки при чтении и изменениях. Предусмотрены ограничение срока </w:t>
+        <w:t xml:space="preserve">Вход выполняется по одноразовой ссылке из Telegram. После входа кабинет проверяет владельца поездки при чтении и изменениях. Предусмотрены ограничение срока сессии и защита запросов на изменение данных. Опубликованное приложение работает по HTTPS: https://travel.product-ai-pav.ru.</w:t>
       </w:r>
       <w:r>
         <w:lastRenderedPageBreak/>
-        <w:t>сессии и защита запросов на изменение данных. Для опубликованного приложения требуется HTTPS.</w:t>
+        <w:t/>
       </w:r>
     </w:p>
     <w:p>

</xml_diff>